<commit_message>
Reflexion finalisiert; Tests/Abnahme als Platzhalter
</commit_message>
<xml_diff>
--- a/Doku/Doku_D_Ergebnisse.docx
+++ b/Doku/Doku_D_Ergebnisse.docx
@@ -696,7 +696,7 @@
           <w:iCs/>
           <w:color w:val="888888"/>
         </w:rPr>
-        <w:t xml:space="preserve">Entwurf / vorläufig (07.06.2026): Die Testphase (Phase 6) hat noch nicht begonnen. Der folgende Text wird nach Durchführung der Tests mit den tatsächlichen Ergebnissen ersetzt.</w:t>
+        <w:t xml:space="preserve">Hinweis (auszufüllen): Dieser Abschnitt wird nach Durchführung der Testphase (Phase 6, KW25–KW26) mit den tatsächlichen Ergebnissen je Testfall ergänzt.</w:t>
       </w:r>
     </w:p>
     <w:p>
@@ -1556,19 +1556,6 @@
       </w:pPr>
       <w:r>
         <w:t xml:space="preserve">5   Reflexion &amp; Bewertung</w:t>
-      </w:r>
-    </w:p>
-    <w:p>
-      <w:pPr>
-        <w:spacing w:after="80" w:before="80" w:line="360" w:lineRule="auto"/>
-      </w:pPr>
-      <w:r>
-        <w:rPr>
-          <w:i/>
-          <w:iCs/>
-          <w:color w:val="888888"/>
-        </w:rPr>
-        <w:t xml:space="preserve">Entwurf / vorläufig (07.06.2026): Die folgende Reflexion ist ein Zwischenstand und wird nach Projektabschluss (Ende KW26) finalisiert. Sie stützt sich auf den bisherigen Verlauf und das Projekttagebuch.</w:t>
       </w:r>
     </w:p>
     <w:p>

</xml_diff>